<commit_message>
almost done otchet 6-7
</commit_message>
<xml_diff>
--- a/Яна. Курсач и Отчеты/Отчет/Шаблон титульного лист для отчёта.docx
+++ b/Яна. Курсач и Отчеты/Отчет/Шаблон титульного лист для отчёта.docx
@@ -1,11 +1,11 @@
 
 <file path=word/document.xml><?xml version="1.0" encoding="utf-8"?>
-<w:document xmlns:wpc="http://schemas.microsoft.com/office/word/2010/wordprocessingCanvas" xmlns:cx="http://schemas.microsoft.com/office/drawing/2014/chartex" xmlns:cx1="http://schemas.microsoft.com/office/drawing/2015/9/8/chartex" xmlns:mc="http://schemas.openxmlformats.org/markup-compatibility/2006" xmlns:o="urn:schemas-microsoft-com:office:office" xmlns:r="http://schemas.openxmlformats.org/officeDocument/2006/relationships" xmlns:m="http://schemas.openxmlformats.org/officeDocument/2006/math" xmlns:v="urn:schemas-microsoft-com:vml" xmlns:wp14="http://schemas.microsoft.com/office/word/2010/wordprocessingDrawing" xmlns:wp="http://schemas.openxmlformats.org/drawingml/2006/wordprocessingDrawing" xmlns:w10="urn:schemas-microsoft-com:office:word" xmlns:w="http://schemas.openxmlformats.org/wordprocessingml/2006/main" xmlns:w14="http://schemas.microsoft.com/office/word/2010/wordml" xmlns:w15="http://schemas.microsoft.com/office/word/2012/wordml" xmlns:w16se="http://schemas.microsoft.com/office/word/2015/wordml/symex" xmlns:wpg="http://schemas.microsoft.com/office/word/2010/wordprocessingGroup" xmlns:wpi="http://schemas.microsoft.com/office/word/2010/wordprocessingInk" xmlns:wne="http://schemas.microsoft.com/office/word/2006/wordml" xmlns:wps="http://schemas.microsoft.com/office/word/2010/wordprocessingShape" mc:Ignorable="w14 w15 w16se wp14">
+<w:document xmlns:wpc="http://schemas.microsoft.com/office/word/2010/wordprocessingCanvas" xmlns:cx="http://schemas.microsoft.com/office/drawing/2014/chartex" xmlns:cx1="http://schemas.microsoft.com/office/drawing/2015/9/8/chartex" xmlns:cx2="http://schemas.microsoft.com/office/drawing/2015/10/21/chartex" xmlns:cx3="http://schemas.microsoft.com/office/drawing/2016/5/9/chartex" xmlns:cx4="http://schemas.microsoft.com/office/drawing/2016/5/10/chartex" xmlns:cx5="http://schemas.microsoft.com/office/drawing/2016/5/11/chartex" xmlns:cx6="http://schemas.microsoft.com/office/drawing/2016/5/12/chartex" xmlns:cx7="http://schemas.microsoft.com/office/drawing/2016/5/13/chartex" xmlns:cx8="http://schemas.microsoft.com/office/drawing/2016/5/14/chartex" xmlns:mc="http://schemas.openxmlformats.org/markup-compatibility/2006" xmlns:aink="http://schemas.microsoft.com/office/drawing/2016/ink" xmlns:am3d="http://schemas.microsoft.com/office/drawing/2017/model3d" xmlns:o="urn:schemas-microsoft-com:office:office" xmlns:r="http://schemas.openxmlformats.org/officeDocument/2006/relationships" xmlns:m="http://schemas.openxmlformats.org/officeDocument/2006/math" xmlns:v="urn:schemas-microsoft-com:vml" xmlns:wp14="http://schemas.microsoft.com/office/word/2010/wordprocessingDrawing" xmlns:wp="http://schemas.openxmlformats.org/drawingml/2006/wordprocessingDrawing" xmlns:w10="urn:schemas-microsoft-com:office:word" xmlns:w="http://schemas.openxmlformats.org/wordprocessingml/2006/main" xmlns:w14="http://schemas.microsoft.com/office/word/2010/wordml" xmlns:w15="http://schemas.microsoft.com/office/word/2012/wordml" xmlns:w16cex="http://schemas.microsoft.com/office/word/2018/wordml/cex" xmlns:w16cid="http://schemas.microsoft.com/office/word/2016/wordml/cid" xmlns:w16="http://schemas.microsoft.com/office/word/2018/wordml" xmlns:w16sdtdh="http://schemas.microsoft.com/office/word/2020/wordml/sdtdatahash" xmlns:w16se="http://schemas.microsoft.com/office/word/2015/wordml/symex" xmlns:wpg="http://schemas.microsoft.com/office/word/2010/wordprocessingGroup" xmlns:wpi="http://schemas.microsoft.com/office/word/2010/wordprocessingInk" xmlns:wne="http://schemas.microsoft.com/office/word/2006/wordml" xmlns:wps="http://schemas.microsoft.com/office/word/2010/wordprocessingShape" mc:Ignorable="w14 w15 w16se w16cid w16 w16cex w16sdtdh wp14">
   <w:body>
     <w:sdt>
       <w:sdtPr>
         <w:rPr>
-          <w:rFonts w:ascii="Times New Roman" w:eastAsia="Times New Roman" w:hAnsi="Times New Roman"/>
+          <w:rFonts w:ascii="Times New Roman" w:eastAsia="Times New Roman" w:hAnsi="Times New Roman" w:cstheme="majorBidi"/>
           <w:b/>
           <w:bCs/>
           <w:snapToGrid w:val="0"/>
@@ -20,7 +20,7 @@
       </w:sdtPr>
       <w:sdtEndPr>
         <w:rPr>
-          <w:rFonts w:eastAsiaTheme="majorEastAsia" w:cstheme="majorBidi"/>
+          <w:rFonts w:eastAsiaTheme="majorEastAsia"/>
           <w:snapToGrid/>
           <w:sz w:val="28"/>
           <w:szCs w:val="32"/>
@@ -1026,6 +1026,13 @@
         </w:p>
         <w:sdt>
           <w:sdtPr>
+            <w:rPr>
+              <w:rFonts w:asciiTheme="minorHAnsi" w:eastAsiaTheme="minorHAnsi" w:hAnsiTheme="minorHAnsi" w:cstheme="minorBidi"/>
+              <w:b w:val="0"/>
+              <w:sz w:val="22"/>
+              <w:szCs w:val="22"/>
+              <w:lang w:eastAsia="en-US"/>
+            </w:rPr>
             <w:id w:val="-331616803"/>
             <w:docPartObj>
               <w:docPartGallery w:val="Table of Contents"/>
@@ -1034,11 +1041,7 @@
           </w:sdtPr>
           <w:sdtEndPr>
             <w:rPr>
-              <w:rFonts w:asciiTheme="minorHAnsi" w:eastAsiaTheme="minorHAnsi" w:hAnsiTheme="minorHAnsi" w:cstheme="minorBidi"/>
               <w:bCs/>
-              <w:sz w:val="22"/>
-              <w:szCs w:val="22"/>
-              <w:lang w:eastAsia="en-US"/>
             </w:rPr>
           </w:sdtEndPr>
           <w:sdtContent>
@@ -1303,10 +1306,7 @@
         </w:numPr>
       </w:pPr>
       <w:r>
-        <w:t>посмотреть вид</w:t>
-      </w:r>
-      <w:r>
-        <w:t>еоматериалы по данному заданию;</w:t>
+        <w:t>посмотреть видеоматериалы по данному заданию;</w:t>
       </w:r>
     </w:p>
     <w:p>
@@ -1318,15 +1318,7 @@
         </w:numPr>
       </w:pPr>
       <w:r>
-        <w:t xml:space="preserve">добавить в проект поддержку XR технологии, импортировав плагин </w:t>
-      </w:r>
-      <w:proofErr w:type="spellStart"/>
-      <w:r>
-        <w:t>Open</w:t>
-      </w:r>
-      <w:proofErr w:type="spellEnd"/>
-      <w:r>
-        <w:t xml:space="preserve"> XR;</w:t>
+        <w:t>добавить в проект поддержку XR технологии, импортировав плагин Open XR;</w:t>
       </w:r>
     </w:p>
     <w:p>
@@ -1430,10 +1422,7 @@
         </w:numPr>
       </w:pPr>
       <w:r>
-        <w:t xml:space="preserve"> </w:t>
-      </w:r>
-      <w:r>
-        <w:t>проверить работоспособность;</w:t>
+        <w:t xml:space="preserve"> проверить работоспособность;</w:t>
       </w:r>
     </w:p>
     <w:p>
@@ -1465,12 +1454,7 @@
         <w:pStyle w:val="af2"/>
       </w:pPr>
       <w:r>
-        <w:t>Ход выпол</w:t>
-      </w:r>
-      <w:bookmarkStart w:id="2" w:name="_GoBack"/>
-      <w:bookmarkEnd w:id="2"/>
-      <w:r>
-        <w:t>нения</w:t>
+        <w:t>Ход выполнения</w:t>
       </w:r>
     </w:p>
     <w:p>
@@ -1481,7 +1465,55 @@
         <w:t>Чтобы настроить механики оружи</w:t>
       </w:r>
       <w:r>
-        <w:t>я и отзывчивость объектов окружения нужно (</w:t>
+        <w:t>я и отзывчивость объектов окружения</w:t>
+      </w:r>
+      <w:r>
+        <w:t xml:space="preserve"> </w:t>
+      </w:r>
+      <w:r>
+        <w:t xml:space="preserve">были установлены соответствующие </w:t>
+      </w:r>
+      <w:r>
+        <w:rPr>
+          <w:lang w:val="en-US"/>
+        </w:rPr>
+        <w:t>XR</w:t>
+      </w:r>
+      <w:r>
+        <w:t xml:space="preserve"> </w:t>
+      </w:r>
+      <w:r>
+        <w:t xml:space="preserve">плагины: </w:t>
+      </w:r>
+      <w:proofErr w:type="spellStart"/>
+      <w:r>
+        <w:t>OpenXR</w:t>
+      </w:r>
+      <w:proofErr w:type="spellEnd"/>
+      <w:r>
+        <w:t xml:space="preserve">, </w:t>
+      </w:r>
+      <w:r>
+        <w:t xml:space="preserve">XR </w:t>
+      </w:r>
+      <w:proofErr w:type="spellStart"/>
+      <w:r>
+        <w:t>Interaction</w:t>
+      </w:r>
+      <w:proofErr w:type="spellEnd"/>
+      <w:r>
+        <w:t xml:space="preserve"> </w:t>
+      </w:r>
+      <w:proofErr w:type="spellStart"/>
+      <w:r>
+        <w:t>Toolkit</w:t>
+      </w:r>
+      <w:proofErr w:type="spellEnd"/>
+      <w:r>
+        <w:t xml:space="preserve"> и другие зависимые к упомянутым плагины. </w:t>
+      </w:r>
+      <w:r>
+        <w:t>(</w:t>
       </w:r>
       <w:r>
         <w:t>названия следующих заголовков 2</w:t>
@@ -1495,7 +1527,17 @@
         <w:pStyle w:val="22"/>
       </w:pPr>
       <w:r>
-        <w:t>Управление рук и перемещение игрока</w:t>
+        <w:lastRenderedPageBreak/>
+        <w:t>П</w:t>
+      </w:r>
+      <w:r>
+        <w:t>еремещение</w:t>
+      </w:r>
+      <w:r>
+        <w:t>м</w:t>
+      </w:r>
+      <w:r>
+        <w:t xml:space="preserve"> игрока</w:t>
       </w:r>
     </w:p>
     <w:p>
@@ -1503,17 +1545,1366 @@
         <w:pStyle w:val="af0"/>
       </w:pPr>
       <w:r>
-        <w:t xml:space="preserve">Как основа механики перемещения и управления рук </w:t>
-      </w:r>
-      <w:r>
-        <w:t xml:space="preserve">был </w:t>
+        <w:t>Как основа механики перемещения и управления рук</w:t>
+      </w:r>
+      <w:r>
+        <w:t>ами</w:t>
       </w:r>
       <w:r>
         <w:t xml:space="preserve"> </w:t>
       </w:r>
+      <w:r>
+        <w:t xml:space="preserve">для поддержки технологий расширенной реальности </w:t>
+      </w:r>
+      <w:r>
+        <w:t>(</w:t>
+      </w:r>
+      <w:r>
+        <w:rPr>
+          <w:lang w:val="en-US"/>
+        </w:rPr>
+        <w:t>XR</w:t>
+      </w:r>
+      <w:r>
+        <w:t xml:space="preserve">) </w:t>
+      </w:r>
+      <w:r>
+        <w:t xml:space="preserve">был выбран </w:t>
+      </w:r>
+      <w:r>
+        <w:rPr>
+          <w:lang w:val="en-US"/>
+        </w:rPr>
+        <w:t>Unity</w:t>
+      </w:r>
+      <w:r>
+        <w:t xml:space="preserve"> </w:t>
+      </w:r>
+      <w:r>
+        <w:t>пакет</w:t>
+      </w:r>
+      <w:r>
+        <w:t xml:space="preserve"> </w:t>
+      </w:r>
+      <w:r>
+        <w:rPr>
+          <w:lang w:val="en-US"/>
+        </w:rPr>
+        <w:t>XR</w:t>
+      </w:r>
+      <w:r>
+        <w:t xml:space="preserve"> </w:t>
+      </w:r>
+      <w:r>
+        <w:rPr>
+          <w:lang w:val="en-US"/>
+        </w:rPr>
+        <w:t>Origin</w:t>
+      </w:r>
+      <w:r>
+        <w:t xml:space="preserve"> [</w:t>
+      </w:r>
+      <w:r>
+        <w:fldChar w:fldCharType="begin"/>
+      </w:r>
+      <w:r>
+        <w:instrText xml:space="preserve"> REF _Ref194917384 \r \h </w:instrText>
+      </w:r>
+      <w:r>
+        <w:fldChar w:fldCharType="separate"/>
+      </w:r>
+      <w:r>
+        <w:t>1</w:t>
+      </w:r>
+      <w:r>
+        <w:fldChar w:fldCharType="end"/>
+      </w:r>
+      <w:r>
+        <w:t>]</w:t>
+      </w:r>
+      <w:r>
+        <w:t>.</w:t>
+      </w:r>
+      <w:r>
+        <w:t xml:space="preserve"> </w:t>
+      </w:r>
+      <w:r>
+        <w:t>Затем на основную сцену</w:t>
+      </w:r>
+      <w:r>
+        <w:t xml:space="preserve"> из этого пакета был добавлен объект </w:t>
+      </w:r>
+      <w:r>
+        <w:rPr>
+          <w:lang w:val="en-US"/>
+        </w:rPr>
+        <w:t>XR</w:t>
+      </w:r>
+      <w:r>
+        <w:t xml:space="preserve"> </w:t>
+      </w:r>
+      <w:r>
+        <w:rPr>
+          <w:lang w:val="en-US"/>
+        </w:rPr>
+        <w:t>Rig</w:t>
+      </w:r>
+      <w:r>
+        <w:t xml:space="preserve"> (</w:t>
+      </w:r>
+      <w:r>
+        <w:t>см. рис. 6.1</w:t>
+      </w:r>
+      <w:r>
+        <w:t>)</w:t>
+      </w:r>
+      <w:r>
+        <w:t>, который выполняет функции управления аватара игрока в пространстве:</w:t>
+      </w:r>
+    </w:p>
+    <w:p>
+      <w:pPr>
+        <w:pStyle w:val="af0"/>
+        <w:numPr>
+          <w:ilvl w:val="0"/>
+          <w:numId w:val="14"/>
+        </w:numPr>
+      </w:pPr>
+      <w:r>
+        <w:t>п</w:t>
+      </w:r>
+      <w:r>
+        <w:t>еремещение в пространстве через джо</w:t>
+      </w:r>
+      <w:r>
+        <w:t>й</w:t>
+      </w:r>
+      <w:r>
+        <w:t>стик левого контроллера</w:t>
+      </w:r>
+      <w:r>
+        <w:t>;</w:t>
+      </w:r>
+    </w:p>
+    <w:p>
+      <w:pPr>
+        <w:pStyle w:val="af0"/>
+        <w:numPr>
+          <w:ilvl w:val="0"/>
+          <w:numId w:val="14"/>
+        </w:numPr>
+      </w:pPr>
+      <w:r>
+        <w:t>п</w:t>
+      </w:r>
+      <w:r>
+        <w:t>оворот камеры от первого лица через джо</w:t>
+      </w:r>
+      <w:r>
+        <w:t>й</w:t>
+      </w:r>
+      <w:r>
+        <w:t>стик правого контроллера</w:t>
+      </w:r>
+      <w:r>
+        <w:t>;</w:t>
+      </w:r>
+    </w:p>
+    <w:p>
+      <w:pPr>
+        <w:pStyle w:val="af0"/>
+        <w:numPr>
+          <w:ilvl w:val="0"/>
+          <w:numId w:val="14"/>
+        </w:numPr>
+      </w:pPr>
+      <w:r>
+        <w:t>в</w:t>
+      </w:r>
+      <w:r>
+        <w:t xml:space="preserve">строенный </w:t>
+      </w:r>
+      <w:r>
+        <w:rPr>
+          <w:lang w:val="en-US"/>
+        </w:rPr>
+        <w:t>Character</w:t>
+      </w:r>
+      <w:r>
+        <w:t xml:space="preserve"> </w:t>
+      </w:r>
+      <w:r>
+        <w:rPr>
+          <w:lang w:val="en-US"/>
+        </w:rPr>
+        <w:t>controller</w:t>
+      </w:r>
+      <w:r>
+        <w:t xml:space="preserve"> </w:t>
+      </w:r>
+      <w:r>
+        <w:t xml:space="preserve">для настройки </w:t>
+      </w:r>
+      <w:r>
+        <w:t>максимально возможны</w:t>
+      </w:r>
+      <w:r>
+        <w:t>й</w:t>
+      </w:r>
+      <w:r>
+        <w:t xml:space="preserve"> </w:t>
+      </w:r>
+      <w:r>
+        <w:t xml:space="preserve">градус </w:t>
+      </w:r>
+      <w:r>
+        <w:t>уклон</w:t>
+      </w:r>
+      <w:r>
+        <w:t>а и</w:t>
+      </w:r>
+      <w:r>
+        <w:t xml:space="preserve"> </w:t>
+      </w:r>
+      <w:r>
+        <w:t xml:space="preserve">максимальная </w:t>
+      </w:r>
+      <w:r>
+        <w:t>высот</w:t>
+      </w:r>
+      <w:r>
+        <w:t>а</w:t>
+      </w:r>
+      <w:r>
+        <w:t xml:space="preserve"> </w:t>
+      </w:r>
+      <w:r>
+        <w:t>выступа для перемещения игрока</w:t>
+      </w:r>
+      <w:r>
+        <w:t>.</w:t>
+      </w:r>
+    </w:p>
+    <w:p>
+      <w:pPr>
+        <w:pStyle w:val="af0"/>
+        <w:ind w:firstLine="0"/>
+        <w:jc w:val="center"/>
+      </w:pPr>
+      <w:r>
+        <w:rPr>
+          <w:noProof/>
+        </w:rPr>
+        <w:drawing>
+          <wp:inline distT="0" distB="0" distL="0" distR="0" wp14:anchorId="6B40D7A6" wp14:editId="42DF7EB5">
+            <wp:extent cx="5791534" cy="2891510"/>
+            <wp:effectExtent l="0" t="0" r="0" b="4445"/>
+            <wp:docPr id="1" name="Рисунок 1"/>
+            <wp:cNvGraphicFramePr>
+              <a:graphicFrameLocks xmlns:a="http://schemas.openxmlformats.org/drawingml/2006/main" noChangeAspect="1"/>
+            </wp:cNvGraphicFramePr>
+            <a:graphic xmlns:a="http://schemas.openxmlformats.org/drawingml/2006/main">
+              <a:graphicData uri="http://schemas.openxmlformats.org/drawingml/2006/picture">
+                <pic:pic xmlns:pic="http://schemas.openxmlformats.org/drawingml/2006/picture">
+                  <pic:nvPicPr>
+                    <pic:cNvPr id="1" name="Рисунок 1"/>
+                    <pic:cNvPicPr/>
+                  </pic:nvPicPr>
+                  <pic:blipFill>
+                    <a:blip r:embed="rId10" cstate="print">
+                      <a:extLst>
+                        <a:ext uri="{28A0092B-C50C-407E-A947-70E740481C1C}">
+                          <a14:useLocalDpi xmlns:a14="http://schemas.microsoft.com/office/drawing/2010/main" val="0"/>
+                        </a:ext>
+                      </a:extLst>
+                    </a:blip>
+                    <a:stretch>
+                      <a:fillRect/>
+                    </a:stretch>
+                  </pic:blipFill>
+                  <pic:spPr>
+                    <a:xfrm>
+                      <a:off x="0" y="0"/>
+                      <a:ext cx="5833998" cy="2912711"/>
+                    </a:xfrm>
+                    <a:prstGeom prst="rect">
+                      <a:avLst/>
+                    </a:prstGeom>
+                  </pic:spPr>
+                </pic:pic>
+              </a:graphicData>
+            </a:graphic>
+          </wp:inline>
+        </w:drawing>
+      </w:r>
+    </w:p>
+    <w:p>
+      <w:pPr>
+        <w:pStyle w:val="af0"/>
+        <w:ind w:firstLine="0"/>
+        <w:jc w:val="center"/>
+        <w:rPr>
+          <w:lang w:val="en-US"/>
+        </w:rPr>
+      </w:pPr>
+      <w:r>
+        <w:t xml:space="preserve">Рисунок 6.1. Настройка </w:t>
+      </w:r>
+      <w:r>
+        <w:rPr>
+          <w:lang w:val="en-US"/>
+        </w:rPr>
+        <w:t>XR Rig</w:t>
+      </w:r>
+    </w:p>
+    <w:p>
+      <w:pPr>
+        <w:pStyle w:val="22"/>
+      </w:pPr>
+      <w:r>
+        <w:t xml:space="preserve">Настройка </w:t>
+      </w:r>
+      <w:r>
+        <w:t>рук и</w:t>
+      </w:r>
+      <w:r>
+        <w:t xml:space="preserve"> оружия</w:t>
+      </w:r>
+    </w:p>
+    <w:p>
+      <w:pPr>
+        <w:pStyle w:val="af0"/>
+      </w:pPr>
+      <w:r>
+        <w:t>Вместо встроенных моделек, симулирующих контроллер были добавлены модели рук. Затем был</w:t>
+      </w:r>
+      <w:r>
+        <w:t>и</w:t>
+      </w:r>
+      <w:r>
+        <w:t xml:space="preserve"> настроены анимации рук при сгибании всех пяти пальцев и сгибании только указательного</w:t>
+      </w:r>
+      <w:r>
+        <w:t xml:space="preserve"> и большого</w:t>
+      </w:r>
+      <w:r>
+        <w:t xml:space="preserve"> (см. рис. 6.2)</w:t>
+      </w:r>
+      <w:r>
+        <w:t xml:space="preserve"> при</w:t>
+      </w:r>
+      <w:r>
+        <w:t xml:space="preserve"> </w:t>
+      </w:r>
+      <w:r>
+        <w:t>нажатии на контроллерах</w:t>
+      </w:r>
+      <w:r>
+        <w:t xml:space="preserve"> </w:t>
+      </w:r>
+      <w:r>
+        <w:t>клавиш</w:t>
+      </w:r>
+      <w:r>
+        <w:t xml:space="preserve"> </w:t>
+      </w:r>
+      <w:proofErr w:type="spellStart"/>
+      <w:r>
+        <w:rPr>
+          <w:lang w:val="en-US"/>
+        </w:rPr>
+        <w:t>HandTrigger</w:t>
+      </w:r>
+      <w:proofErr w:type="spellEnd"/>
+      <w:r>
+        <w:t xml:space="preserve"> </w:t>
+      </w:r>
+      <w:r>
+        <w:t xml:space="preserve">и </w:t>
+      </w:r>
+      <w:proofErr w:type="spellStart"/>
+      <w:r>
+        <w:rPr>
+          <w:lang w:val="en-US"/>
+        </w:rPr>
+        <w:t>IndexTrigger</w:t>
+      </w:r>
+      <w:proofErr w:type="spellEnd"/>
+      <w:r>
+        <w:t xml:space="preserve"> </w:t>
+      </w:r>
+      <w:r>
+        <w:t>[</w:t>
+      </w:r>
+      <w:r>
+        <w:fldChar w:fldCharType="begin"/>
+      </w:r>
+      <w:r>
+        <w:instrText xml:space="preserve"> REF _Ref194924998 \r \h </w:instrText>
+      </w:r>
+      <w:r>
+        <w:fldChar w:fldCharType="separate"/>
+      </w:r>
+      <w:r>
+        <w:t>3</w:t>
+      </w:r>
+      <w:r>
+        <w:fldChar w:fldCharType="end"/>
+      </w:r>
+      <w:r>
+        <w:t>]</w:t>
+      </w:r>
+      <w:r>
+        <w:t xml:space="preserve"> </w:t>
+      </w:r>
+      <w:r>
+        <w:t>соответственно.</w:t>
+      </w:r>
+    </w:p>
+    <w:p>
+      <w:pPr>
+        <w:pStyle w:val="af0"/>
+      </w:pPr>
+      <w:r>
+        <w:t xml:space="preserve">Далее был добавлен </w:t>
+      </w:r>
+      <w:proofErr w:type="spellStart"/>
+      <w:r>
+        <w:t>грейбокс</w:t>
+      </w:r>
+      <w:proofErr w:type="spellEnd"/>
+      <w:r>
+        <w:t xml:space="preserve"> оружия, к которому был подключен </w:t>
+      </w:r>
+      <w:r>
+        <w:t xml:space="preserve">скрипт </w:t>
+      </w:r>
+      <w:proofErr w:type="spellStart"/>
+      <w:r>
+        <w:t>XRGrabInteractable</w:t>
+      </w:r>
+      <w:proofErr w:type="spellEnd"/>
+      <w:r>
+        <w:t xml:space="preserve"> [</w:t>
+      </w:r>
+      <w:r>
+        <w:fldChar w:fldCharType="begin"/>
+      </w:r>
+      <w:r>
+        <w:instrText xml:space="preserve"> REF _Ref194929210 \r \h </w:instrText>
+      </w:r>
+      <w:r>
+        <w:fldChar w:fldCharType="separate"/>
+      </w:r>
+      <w:r>
+        <w:t>4</w:t>
+      </w:r>
+      <w:r>
+        <w:fldChar w:fldCharType="end"/>
+      </w:r>
+      <w:r>
+        <w:t>]</w:t>
+      </w:r>
+      <w:r>
+        <w:t xml:space="preserve">. Предметы с этим </w:t>
+      </w:r>
+      <w:proofErr w:type="spellStart"/>
+      <w:r>
+        <w:t>компанентом</w:t>
+      </w:r>
+      <w:proofErr w:type="spellEnd"/>
+      <w:r>
+        <w:t xml:space="preserve"> могут браться в руки игрока</w:t>
+      </w:r>
+      <w:r>
+        <w:t xml:space="preserve"> через клавиши </w:t>
+      </w:r>
+      <w:proofErr w:type="spellStart"/>
+      <w:r>
+        <w:rPr>
+          <w:lang w:val="en-US"/>
+        </w:rPr>
+        <w:t>HandTrigger</w:t>
+      </w:r>
+      <w:proofErr w:type="spellEnd"/>
+      <w:r>
+        <w:t xml:space="preserve"> на обоих руках.</w:t>
+      </w:r>
+      <w:r>
+        <w:t xml:space="preserve"> Для корректного отображения интерактивного предмета в руках был создан новый класс </w:t>
+      </w:r>
+      <w:proofErr w:type="spellStart"/>
+      <w:r>
+        <w:rPr>
+          <w:lang w:val="en-US"/>
+        </w:rPr>
+        <w:t>GrabStabilizerXR</w:t>
+      </w:r>
+      <w:proofErr w:type="spellEnd"/>
+      <w:r>
+        <w:t xml:space="preserve">, наследуемый от </w:t>
+      </w:r>
+      <w:proofErr w:type="spellStart"/>
+      <w:r>
+        <w:t>XRGrabInteractable</w:t>
+      </w:r>
+      <w:proofErr w:type="spellEnd"/>
+      <w:r>
+        <w:t xml:space="preserve">. В новом классе была реализована перегрузка </w:t>
+      </w:r>
+      <w:r>
+        <w:lastRenderedPageBreak/>
+        <w:t xml:space="preserve">родительского метода </w:t>
+      </w:r>
+      <w:proofErr w:type="spellStart"/>
+      <w:r>
+        <w:rPr>
+          <w:lang w:val="en-US"/>
+        </w:rPr>
+        <w:t>OnSelectEntering</w:t>
+      </w:r>
+      <w:proofErr w:type="spellEnd"/>
+      <w:r>
+        <w:t xml:space="preserve"> </w:t>
+      </w:r>
+      <w:r>
+        <w:t>(</w:t>
+      </w:r>
+      <w:proofErr w:type="spellStart"/>
+      <w:r>
+        <w:t>SelectEnterEventArgs</w:t>
+      </w:r>
+      <w:proofErr w:type="spellEnd"/>
+      <w:r>
+        <w:t xml:space="preserve"> </w:t>
+      </w:r>
+      <w:proofErr w:type="spellStart"/>
+      <w:r>
+        <w:t>args</w:t>
+      </w:r>
+      <w:proofErr w:type="spellEnd"/>
+      <w:r>
+        <w:t xml:space="preserve">), </w:t>
+      </w:r>
+      <w:r>
+        <w:t>которая давала возможность перед взятием объекта настроить точку расположения</w:t>
+      </w:r>
+      <w:r>
+        <w:t xml:space="preserve"> (</w:t>
+      </w:r>
+      <w:r>
+        <w:rPr>
+          <w:lang w:val="en-US"/>
+        </w:rPr>
+        <w:t>attach</w:t>
+      </w:r>
+      <w:r>
+        <w:t xml:space="preserve"> </w:t>
+      </w:r>
+      <w:r>
+        <w:rPr>
+          <w:lang w:val="en-US"/>
+        </w:rPr>
+        <w:t>point</w:t>
+      </w:r>
+      <w:r>
+        <w:t>)</w:t>
+      </w:r>
+      <w:r>
+        <w:t xml:space="preserve"> в </w:t>
+      </w:r>
+      <w:r>
+        <w:t xml:space="preserve">используемой </w:t>
+      </w:r>
+      <w:r>
+        <w:t>руке</w:t>
+      </w:r>
+      <w:r>
+        <w:t xml:space="preserve"> (</w:t>
+      </w:r>
+      <w:r>
+        <w:t>см. рис. 6.3</w:t>
+      </w:r>
+      <w:r>
+        <w:t>)</w:t>
+      </w:r>
+      <w:r>
+        <w:t>.</w:t>
+      </w:r>
+    </w:p>
+    <w:p>
+      <w:pPr>
+        <w:pStyle w:val="af0"/>
+        <w:ind w:firstLine="0"/>
+        <w:jc w:val="center"/>
+        <w:rPr>
+          <w:lang w:val="en-US"/>
+        </w:rPr>
+      </w:pPr>
+      <w:r>
+        <w:rPr>
+          <w:noProof/>
+          <w:lang w:val="en-US"/>
+        </w:rPr>
+        <w:drawing>
+          <wp:inline distT="0" distB="0" distL="0" distR="0" wp14:anchorId="10D7C706" wp14:editId="71D9CB62">
+            <wp:extent cx="3508744" cy="2245264"/>
+            <wp:effectExtent l="0" t="0" r="0" b="3175"/>
+            <wp:docPr id="3" name="Рисунок 3"/>
+            <wp:cNvGraphicFramePr>
+              <a:graphicFrameLocks xmlns:a="http://schemas.openxmlformats.org/drawingml/2006/main" noChangeAspect="1"/>
+            </wp:cNvGraphicFramePr>
+            <a:graphic xmlns:a="http://schemas.openxmlformats.org/drawingml/2006/main">
+              <a:graphicData uri="http://schemas.openxmlformats.org/drawingml/2006/picture">
+                <pic:pic xmlns:pic="http://schemas.openxmlformats.org/drawingml/2006/picture">
+                  <pic:nvPicPr>
+                    <pic:cNvPr id="3" name="Рисунок 3"/>
+                    <pic:cNvPicPr/>
+                  </pic:nvPicPr>
+                  <pic:blipFill>
+                    <a:blip r:embed="rId11" cstate="print">
+                      <a:extLst>
+                        <a:ext uri="{28A0092B-C50C-407E-A947-70E740481C1C}">
+                          <a14:useLocalDpi xmlns:a14="http://schemas.microsoft.com/office/drawing/2010/main" val="0"/>
+                        </a:ext>
+                      </a:extLst>
+                    </a:blip>
+                    <a:stretch>
+                      <a:fillRect/>
+                    </a:stretch>
+                  </pic:blipFill>
+                  <pic:spPr>
+                    <a:xfrm>
+                      <a:off x="0" y="0"/>
+                      <a:ext cx="3530573" cy="2259232"/>
+                    </a:xfrm>
+                    <a:prstGeom prst="rect">
+                      <a:avLst/>
+                    </a:prstGeom>
+                  </pic:spPr>
+                </pic:pic>
+              </a:graphicData>
+            </a:graphic>
+          </wp:inline>
+        </w:drawing>
+      </w:r>
+    </w:p>
+    <w:p>
+      <w:pPr>
+        <w:pStyle w:val="af0"/>
+        <w:ind w:firstLine="0"/>
+        <w:jc w:val="center"/>
+      </w:pPr>
+      <w:r>
+        <w:t>Рисунок 6.2. Модели рук в игровом мире</w:t>
+      </w:r>
+    </w:p>
+    <w:p>
+      <w:pPr>
+        <w:pStyle w:val="af0"/>
+        <w:ind w:firstLine="0"/>
+        <w:jc w:val="center"/>
+      </w:pPr>
+      <w:r>
+        <w:rPr>
+          <w:noProof/>
+        </w:rPr>
+        <w:drawing>
+          <wp:inline distT="0" distB="0" distL="0" distR="0" wp14:anchorId="77E66BCE" wp14:editId="3D02C326">
+            <wp:extent cx="5273749" cy="3354425"/>
+            <wp:effectExtent l="0" t="0" r="3175" b="0"/>
+            <wp:docPr id="5" name="Рисунок 5"/>
+            <wp:cNvGraphicFramePr>
+              <a:graphicFrameLocks xmlns:a="http://schemas.openxmlformats.org/drawingml/2006/main" noChangeAspect="1"/>
+            </wp:cNvGraphicFramePr>
+            <a:graphic xmlns:a="http://schemas.openxmlformats.org/drawingml/2006/main">
+              <a:graphicData uri="http://schemas.openxmlformats.org/drawingml/2006/picture">
+                <pic:pic xmlns:pic="http://schemas.openxmlformats.org/drawingml/2006/picture">
+                  <pic:nvPicPr>
+                    <pic:cNvPr id="5" name="Рисунок 5"/>
+                    <pic:cNvPicPr/>
+                  </pic:nvPicPr>
+                  <pic:blipFill>
+                    <a:blip r:embed="rId12">
+                      <a:extLst>
+                        <a:ext uri="{28A0092B-C50C-407E-A947-70E740481C1C}">
+                          <a14:useLocalDpi xmlns:a14="http://schemas.microsoft.com/office/drawing/2010/main" val="0"/>
+                        </a:ext>
+                      </a:extLst>
+                    </a:blip>
+                    <a:stretch>
+                      <a:fillRect/>
+                    </a:stretch>
+                  </pic:blipFill>
+                  <pic:spPr>
+                    <a:xfrm>
+                      <a:off x="0" y="0"/>
+                      <a:ext cx="5278598" cy="3357509"/>
+                    </a:xfrm>
+                    <a:prstGeom prst="rect">
+                      <a:avLst/>
+                    </a:prstGeom>
+                  </pic:spPr>
+                </pic:pic>
+              </a:graphicData>
+            </a:graphic>
+          </wp:inline>
+        </w:drawing>
+      </w:r>
+    </w:p>
+    <w:p>
+      <w:pPr>
+        <w:pStyle w:val="af0"/>
+        <w:ind w:firstLine="0"/>
+        <w:jc w:val="center"/>
+        <w:rPr>
+          <w:lang w:val="en-US"/>
+        </w:rPr>
+      </w:pPr>
+      <w:r>
+        <w:t>Рисунок 6.3. Прототип</w:t>
+      </w:r>
+      <w:r>
+        <w:t>ы</w:t>
+      </w:r>
+      <w:r>
+        <w:t xml:space="preserve"> оружи</w:t>
+      </w:r>
+      <w:r>
+        <w:t>й</w:t>
+      </w:r>
+      <w:r>
+        <w:t xml:space="preserve"> с компонент</w:t>
+      </w:r>
+      <w:r>
+        <w:t>а</w:t>
+      </w:r>
+      <w:r>
+        <w:t>м</w:t>
+      </w:r>
+      <w:r>
+        <w:t>и</w:t>
+      </w:r>
+      <w:r>
+        <w:t xml:space="preserve"> </w:t>
+      </w:r>
+      <w:proofErr w:type="spellStart"/>
+      <w:r>
+        <w:rPr>
+          <w:lang w:val="en-US"/>
+        </w:rPr>
+        <w:t>GrabStabilizerXR</w:t>
+      </w:r>
+      <w:proofErr w:type="spellEnd"/>
+    </w:p>
+    <w:p>
+      <w:pPr>
+        <w:pStyle w:val="22"/>
+      </w:pPr>
+      <w:r>
+        <w:t xml:space="preserve">Реакция игрового мира на </w:t>
+      </w:r>
+      <w:r>
+        <w:t>игрока</w:t>
+      </w:r>
+    </w:p>
+    <w:p>
+      <w:pPr>
+        <w:pStyle w:val="af0"/>
+      </w:pPr>
+      <w:proofErr w:type="spellStart"/>
+      <w:r>
+        <w:t>Грейбоксы</w:t>
+      </w:r>
+      <w:proofErr w:type="spellEnd"/>
+      <w:r>
+        <w:t xml:space="preserve"> окружения и оружия на сцене были заменены на соответствующие коллажи с настроенными коллайдерами (см. рис. 7.1)</w:t>
+      </w:r>
+      <w:r>
+        <w:t>.</w:t>
+      </w:r>
+    </w:p>
+    <w:p>
+      <w:pPr>
+        <w:pStyle w:val="af0"/>
+      </w:pPr>
+      <w:r>
+        <w:t>Далее был добавлен интерактивный объект</w:t>
+      </w:r>
+      <w:r>
+        <w:t xml:space="preserve"> </w:t>
+      </w:r>
+      <w:r>
+        <w:t xml:space="preserve">идол. </w:t>
+      </w:r>
+      <w:r>
+        <w:t xml:space="preserve">При ударе идола </w:t>
+      </w:r>
+      <w:r>
+        <w:t>оружием</w:t>
+      </w:r>
+      <w:r>
+        <w:t xml:space="preserve"> </w:t>
+      </w:r>
+      <w:r>
+        <w:t xml:space="preserve">(объектом с компонентом </w:t>
+      </w:r>
+      <w:r>
+        <w:rPr>
+          <w:lang w:val="en-US"/>
+        </w:rPr>
+        <w:t>Weapon</w:t>
+      </w:r>
+      <w:r>
+        <w:t>)</w:t>
+      </w:r>
+      <w:r>
+        <w:t xml:space="preserve"> </w:t>
+      </w:r>
+      <w:r>
+        <w:t>вызывается эффект удара</w:t>
+      </w:r>
+      <w:r>
+        <w:t xml:space="preserve"> </w:t>
+      </w:r>
+      <w:r>
+        <w:t xml:space="preserve">об идол. Если нанести </w:t>
+      </w:r>
+      <w:r>
+        <w:lastRenderedPageBreak/>
+        <w:t>достаточно ударов</w:t>
+      </w:r>
+      <w:r>
+        <w:t xml:space="preserve">, </w:t>
+      </w:r>
+      <w:r>
+        <w:t>прочность идола упадет до нуля и объект уничтожится</w:t>
+      </w:r>
+      <w:r>
+        <w:t xml:space="preserve">, такое поведение определено компонентом </w:t>
+      </w:r>
+      <w:r>
+        <w:rPr>
+          <w:lang w:val="en-US"/>
+        </w:rPr>
+        <w:t>Breakable</w:t>
+      </w:r>
+      <w:r>
+        <w:t>.</w:t>
+      </w:r>
+    </w:p>
+    <w:p>
+      <w:pPr>
+        <w:pStyle w:val="af0"/>
+        <w:ind w:firstLine="0"/>
+        <w:jc w:val="center"/>
+      </w:pPr>
+      <w:r>
+        <w:rPr>
+          <w:noProof/>
+        </w:rPr>
+        <w:drawing>
+          <wp:inline distT="0" distB="0" distL="0" distR="0" wp14:anchorId="189C59EA" wp14:editId="05A2A1AF">
+            <wp:extent cx="5032566" cy="2830664"/>
+            <wp:effectExtent l="0" t="0" r="0" b="8255"/>
+            <wp:docPr id="6" name="Рисунок 6"/>
+            <wp:cNvGraphicFramePr>
+              <a:graphicFrameLocks xmlns:a="http://schemas.openxmlformats.org/drawingml/2006/main" noChangeAspect="1"/>
+            </wp:cNvGraphicFramePr>
+            <a:graphic xmlns:a="http://schemas.openxmlformats.org/drawingml/2006/main">
+              <a:graphicData uri="http://schemas.openxmlformats.org/drawingml/2006/picture">
+                <pic:pic xmlns:pic="http://schemas.openxmlformats.org/drawingml/2006/picture">
+                  <pic:nvPicPr>
+                    <pic:cNvPr id="1" name=""/>
+                    <pic:cNvPicPr/>
+                  </pic:nvPicPr>
+                  <pic:blipFill>
+                    <a:blip r:embed="rId13"/>
+                    <a:stretch>
+                      <a:fillRect/>
+                    </a:stretch>
+                  </pic:blipFill>
+                  <pic:spPr>
+                    <a:xfrm>
+                      <a:off x="0" y="0"/>
+                      <a:ext cx="5036414" cy="2832828"/>
+                    </a:xfrm>
+                    <a:prstGeom prst="rect">
+                      <a:avLst/>
+                    </a:prstGeom>
+                  </pic:spPr>
+                </pic:pic>
+              </a:graphicData>
+            </a:graphic>
+          </wp:inline>
+        </w:drawing>
+      </w:r>
+    </w:p>
+    <w:p>
+      <w:pPr>
+        <w:pStyle w:val="af0"/>
+        <w:ind w:firstLine="0"/>
+        <w:jc w:val="center"/>
+      </w:pPr>
+      <w:r>
+        <w:t xml:space="preserve">Рисунок 6.3. </w:t>
+      </w:r>
+      <w:r>
+        <w:t xml:space="preserve">Оружие с полноценным </w:t>
+      </w:r>
+      <w:proofErr w:type="spellStart"/>
+      <w:r>
+        <w:t>коллажом</w:t>
+      </w:r>
+      <w:proofErr w:type="spellEnd"/>
+      <w:r>
+        <w:t xml:space="preserve"> и коллайдером</w:t>
+      </w:r>
+    </w:p>
+    <w:p>
+      <w:pPr>
+        <w:pStyle w:val="af0"/>
+        <w:ind w:firstLine="0"/>
+      </w:pPr>
+    </w:p>
+    <w:p>
+      <w:pPr>
+        <w:pStyle w:val="af0"/>
+        <w:ind w:firstLine="0"/>
+      </w:pPr>
+      <w:r>
+        <w:br w:type="page"/>
+      </w:r>
+    </w:p>
+    <w:p>
+      <w:pPr>
+        <w:pStyle w:val="af2"/>
+      </w:pPr>
+      <w:r>
+        <w:lastRenderedPageBreak/>
+        <w:t>Список использ</w:t>
+      </w:r>
+      <w:r>
+        <w:t>ованных</w:t>
+      </w:r>
+      <w:r>
+        <w:t xml:space="preserve"> источников</w:t>
+      </w:r>
+    </w:p>
+    <w:p>
+      <w:pPr>
+        <w:pStyle w:val="af0"/>
+        <w:numPr>
+          <w:ilvl w:val="0"/>
+          <w:numId w:val="13"/>
+        </w:numPr>
+      </w:pPr>
+      <w:bookmarkStart w:id="2" w:name="_Ref194917384"/>
+      <w:r>
+        <w:t xml:space="preserve">XR </w:t>
+      </w:r>
+      <w:proofErr w:type="spellStart"/>
+      <w:r>
+        <w:t>Origin</w:t>
+      </w:r>
+      <w:proofErr w:type="spellEnd"/>
+      <w:r>
+        <w:t xml:space="preserve"> </w:t>
+      </w:r>
+      <w:r>
+        <w:t>[</w:t>
+      </w:r>
+      <w:r>
+        <w:t>электронный ресурс</w:t>
+      </w:r>
+      <w:r>
+        <w:t>]</w:t>
+      </w:r>
+      <w:r>
+        <w:t xml:space="preserve">. Режим доступа: </w:t>
+      </w:r>
+      <w:hyperlink r:id="rId14" w:history="1">
+        <w:r>
+          <w:rPr>
+            <w:rStyle w:val="a4"/>
+          </w:rPr>
+          <w:t>https://docs.unity3d.com/2023.2/Documentation/Manual/xr-origin.html</w:t>
+        </w:r>
+      </w:hyperlink>
+      <w:r>
+        <w:t xml:space="preserve">. </w:t>
+      </w:r>
+      <w:r>
+        <w:br/>
+      </w:r>
+      <w:r>
+        <w:t>(Дата обращения: 01.04.2025)</w:t>
+      </w:r>
+      <w:r>
+        <w:t>.</w:t>
+      </w:r>
+      <w:bookmarkEnd w:id="2"/>
+    </w:p>
+    <w:p>
+      <w:pPr>
+        <w:pStyle w:val="af0"/>
+        <w:numPr>
+          <w:ilvl w:val="0"/>
+          <w:numId w:val="13"/>
+        </w:numPr>
+      </w:pPr>
+      <w:proofErr w:type="spellStart"/>
+      <w:r>
+        <w:t>Character</w:t>
+      </w:r>
+      <w:proofErr w:type="spellEnd"/>
+      <w:r>
+        <w:t xml:space="preserve"> </w:t>
+      </w:r>
+      <w:proofErr w:type="spellStart"/>
+      <w:r>
+        <w:t>Controller</w:t>
+      </w:r>
+      <w:proofErr w:type="spellEnd"/>
+      <w:r>
+        <w:t xml:space="preserve"> </w:t>
+      </w:r>
+      <w:r>
+        <w:t>[</w:t>
+      </w:r>
+      <w:r>
+        <w:t>электронный ресурс</w:t>
+      </w:r>
+      <w:r>
+        <w:t>]</w:t>
+      </w:r>
+      <w:r>
+        <w:t>. Режим доступа:</w:t>
+      </w:r>
+      <w:r>
+        <w:t xml:space="preserve"> </w:t>
+      </w:r>
+      <w:hyperlink r:id="rId15" w:history="1">
+        <w:r>
+          <w:rPr>
+            <w:rStyle w:val="a4"/>
+          </w:rPr>
+          <w:t>https://docs.unity3d.com/ru/530/Manual/class-CharacterController.html</w:t>
+        </w:r>
+      </w:hyperlink>
+      <w:r>
+        <w:t xml:space="preserve">. </w:t>
+      </w:r>
+      <w:r>
+        <w:br/>
+      </w:r>
+      <w:r>
+        <w:t>(Дата обращения: 01.04.2025).</w:t>
+      </w:r>
+    </w:p>
+    <w:p>
+      <w:pPr>
+        <w:pStyle w:val="af0"/>
+        <w:numPr>
+          <w:ilvl w:val="0"/>
+          <w:numId w:val="13"/>
+        </w:numPr>
+      </w:pPr>
+      <w:bookmarkStart w:id="3" w:name="_Ref194924998"/>
+      <w:proofErr w:type="spellStart"/>
+      <w:r>
+        <w:t>Input</w:t>
+      </w:r>
+      <w:proofErr w:type="spellEnd"/>
+      <w:r>
+        <w:t xml:space="preserve"> </w:t>
+      </w:r>
+      <w:proofErr w:type="spellStart"/>
+      <w:r>
+        <w:t>for</w:t>
+      </w:r>
+      <w:proofErr w:type="spellEnd"/>
+      <w:r>
+        <w:t xml:space="preserve"> </w:t>
+      </w:r>
+      <w:proofErr w:type="spellStart"/>
+      <w:r>
+        <w:t>Oculus</w:t>
+      </w:r>
+      <w:proofErr w:type="spellEnd"/>
+      <w:r>
+        <w:t xml:space="preserve"> </w:t>
+      </w:r>
+      <w:r>
+        <w:t>[</w:t>
+      </w:r>
+      <w:r>
+        <w:t>электронный ресурс</w:t>
+      </w:r>
+      <w:r>
+        <w:t>]</w:t>
+      </w:r>
+      <w:r>
+        <w:t>. Режим доступа:</w:t>
+      </w:r>
+      <w:r>
+        <w:t xml:space="preserve"> </w:t>
+      </w:r>
+      <w:hyperlink r:id="rId16" w:history="1">
+        <w:r>
+          <w:rPr>
+            <w:rStyle w:val="a4"/>
+          </w:rPr>
+          <w:t>https://docs.unity3d.com/550/Documentation/Manual/OculusControllers.html</w:t>
+        </w:r>
+      </w:hyperlink>
+      <w:r>
+        <w:t>. (Дата обращения: 07.04.2025)</w:t>
+      </w:r>
+      <w:bookmarkEnd w:id="3"/>
+    </w:p>
+    <w:p>
+      <w:pPr>
+        <w:pStyle w:val="af0"/>
+        <w:numPr>
+          <w:ilvl w:val="0"/>
+          <w:numId w:val="13"/>
+        </w:numPr>
+      </w:pPr>
+      <w:bookmarkStart w:id="4" w:name="_Ref194929210"/>
+      <w:r>
+        <w:rPr>
+          <w:lang w:val="en-US"/>
+        </w:rPr>
+        <w:t>XR</w:t>
+      </w:r>
+      <w:r>
+        <w:t xml:space="preserve"> </w:t>
+      </w:r>
+      <w:r>
+        <w:rPr>
+          <w:lang w:val="en-US"/>
+        </w:rPr>
+        <w:t>Interaction</w:t>
+      </w:r>
+      <w:r>
+        <w:t xml:space="preserve"> </w:t>
+      </w:r>
+      <w:r>
+        <w:rPr>
+          <w:lang w:val="en-US"/>
+        </w:rPr>
+        <w:t>Toolkit</w:t>
+      </w:r>
+      <w:r>
+        <w:t xml:space="preserve"> [</w:t>
+      </w:r>
+      <w:r>
+        <w:t>электронный</w:t>
+      </w:r>
+      <w:r>
+        <w:t xml:space="preserve"> </w:t>
+      </w:r>
+      <w:r>
+        <w:t>ресурс</w:t>
+      </w:r>
+      <w:r>
+        <w:t>]</w:t>
+      </w:r>
+      <w:r>
+        <w:t xml:space="preserve">. Режим доступа: </w:t>
+      </w:r>
+      <w:hyperlink r:id="rId17" w:history="1">
+        <w:r>
+          <w:rPr>
+            <w:rStyle w:val="a4"/>
+            <w:lang w:val="en-US"/>
+          </w:rPr>
+          <w:t>https</w:t>
+        </w:r>
+        <w:r>
+          <w:rPr>
+            <w:rStyle w:val="a4"/>
+          </w:rPr>
+          <w:t>://</w:t>
+        </w:r>
+        <w:r>
+          <w:rPr>
+            <w:rStyle w:val="a4"/>
+            <w:lang w:val="en-US"/>
+          </w:rPr>
+          <w:t>docs</w:t>
+        </w:r>
+        <w:r>
+          <w:rPr>
+            <w:rStyle w:val="a4"/>
+          </w:rPr>
+          <w:t>.</w:t>
+        </w:r>
+        <w:r>
+          <w:rPr>
+            <w:rStyle w:val="a4"/>
+            <w:lang w:val="en-US"/>
+          </w:rPr>
+          <w:t>unity</w:t>
+        </w:r>
+        <w:r>
+          <w:rPr>
+            <w:rStyle w:val="a4"/>
+          </w:rPr>
+          <w:t>3</w:t>
+        </w:r>
+        <w:r>
+          <w:rPr>
+            <w:rStyle w:val="a4"/>
+            <w:lang w:val="en-US"/>
+          </w:rPr>
+          <w:t>d</w:t>
+        </w:r>
+        <w:r>
+          <w:rPr>
+            <w:rStyle w:val="a4"/>
+          </w:rPr>
+          <w:t>.</w:t>
+        </w:r>
+        <w:r>
+          <w:rPr>
+            <w:rStyle w:val="a4"/>
+            <w:lang w:val="en-US"/>
+          </w:rPr>
+          <w:t>com</w:t>
+        </w:r>
+        <w:r>
+          <w:rPr>
+            <w:rStyle w:val="a4"/>
+          </w:rPr>
+          <w:t>/</w:t>
+        </w:r>
+        <w:r>
+          <w:rPr>
+            <w:rStyle w:val="a4"/>
+            <w:lang w:val="en-US"/>
+          </w:rPr>
+          <w:t>Packages</w:t>
+        </w:r>
+        <w:r>
+          <w:rPr>
+            <w:rStyle w:val="a4"/>
+          </w:rPr>
+          <w:t>/</w:t>
+        </w:r>
+        <w:r>
+          <w:rPr>
+            <w:rStyle w:val="a4"/>
+            <w:lang w:val="en-US"/>
+          </w:rPr>
+          <w:t>com</w:t>
+        </w:r>
+        <w:r>
+          <w:rPr>
+            <w:rStyle w:val="a4"/>
+          </w:rPr>
+          <w:t>.</w:t>
+        </w:r>
+        <w:r>
+          <w:rPr>
+            <w:rStyle w:val="a4"/>
+            <w:lang w:val="en-US"/>
+          </w:rPr>
+          <w:t>unity</w:t>
+        </w:r>
+        <w:r>
+          <w:rPr>
+            <w:rStyle w:val="a4"/>
+          </w:rPr>
+          <w:t>.</w:t>
+        </w:r>
+        <w:r>
+          <w:rPr>
+            <w:rStyle w:val="a4"/>
+            <w:lang w:val="en-US"/>
+          </w:rPr>
+          <w:t>xr</w:t>
+        </w:r>
+        <w:r>
+          <w:rPr>
+            <w:rStyle w:val="a4"/>
+          </w:rPr>
+          <w:t>.</w:t>
+        </w:r>
+        <w:r>
+          <w:rPr>
+            <w:rStyle w:val="a4"/>
+            <w:lang w:val="en-US"/>
+          </w:rPr>
+          <w:t>interaction</w:t>
+        </w:r>
+        <w:r>
+          <w:rPr>
+            <w:rStyle w:val="a4"/>
+          </w:rPr>
+          <w:t>.</w:t>
+        </w:r>
+        <w:r>
+          <w:rPr>
+            <w:rStyle w:val="a4"/>
+            <w:lang w:val="en-US"/>
+          </w:rPr>
+          <w:t>toolkit</w:t>
+        </w:r>
+        <w:r>
+          <w:rPr>
+            <w:rStyle w:val="a4"/>
+          </w:rPr>
+          <w:t>@2.0/</w:t>
+        </w:r>
+        <w:r>
+          <w:rPr>
+            <w:rStyle w:val="a4"/>
+            <w:lang w:val="en-US"/>
+          </w:rPr>
+          <w:t>manual</w:t>
+        </w:r>
+        <w:r>
+          <w:rPr>
+            <w:rStyle w:val="a4"/>
+          </w:rPr>
+          <w:t>/</w:t>
+        </w:r>
+        <w:r>
+          <w:rPr>
+            <w:rStyle w:val="a4"/>
+            <w:lang w:val="en-US"/>
+          </w:rPr>
+          <w:t>index</w:t>
+        </w:r>
+        <w:r>
+          <w:rPr>
+            <w:rStyle w:val="a4"/>
+          </w:rPr>
+          <w:t>.</w:t>
+        </w:r>
+        <w:r>
+          <w:rPr>
+            <w:rStyle w:val="a4"/>
+            <w:lang w:val="en-US"/>
+          </w:rPr>
+          <w:t>html</w:t>
+        </w:r>
+      </w:hyperlink>
+      <w:r>
+        <w:t xml:space="preserve">. (Дата обращения: </w:t>
+      </w:r>
+      <w:r>
+        <w:t>07.04.2025</w:t>
+      </w:r>
+      <w:r>
+        <w:t>).</w:t>
+      </w:r>
+      <w:bookmarkEnd w:id="4"/>
     </w:p>
     <w:sectPr>
-      <w:footerReference w:type="default" r:id="rId10"/>
+      <w:footerReference w:type="default" r:id="rId18"/>
       <w:pgSz w:w="11906" w:h="16838"/>
       <w:pgMar w:top="1134" w:right="567" w:bottom="1134" w:left="1134" w:header="709" w:footer="709" w:gutter="0"/>
       <w:pgNumType w:start="2"/>
@@ -1525,7 +2916,7 @@
 </file>
 
 <file path=word/endnotes.xml><?xml version="1.0" encoding="utf-8"?>
-<w:endnotes xmlns:wpc="http://schemas.microsoft.com/office/word/2010/wordprocessingCanvas" xmlns:cx="http://schemas.microsoft.com/office/drawing/2014/chartex" xmlns:cx1="http://schemas.microsoft.com/office/drawing/2015/9/8/chartex" xmlns:mc="http://schemas.openxmlformats.org/markup-compatibility/2006" xmlns:o="urn:schemas-microsoft-com:office:office" xmlns:r="http://schemas.openxmlformats.org/officeDocument/2006/relationships" xmlns:m="http://schemas.openxmlformats.org/officeDocument/2006/math" xmlns:v="urn:schemas-microsoft-com:vml" xmlns:wp14="http://schemas.microsoft.com/office/word/2010/wordprocessingDrawing" xmlns:wp="http://schemas.openxmlformats.org/drawingml/2006/wordprocessingDrawing" xmlns:w10="urn:schemas-microsoft-com:office:word" xmlns:w="http://schemas.openxmlformats.org/wordprocessingml/2006/main" xmlns:w14="http://schemas.microsoft.com/office/word/2010/wordml" xmlns:w15="http://schemas.microsoft.com/office/word/2012/wordml" xmlns:w16se="http://schemas.microsoft.com/office/word/2015/wordml/symex" xmlns:wpg="http://schemas.microsoft.com/office/word/2010/wordprocessingGroup" xmlns:wpi="http://schemas.microsoft.com/office/word/2010/wordprocessingInk" xmlns:wne="http://schemas.microsoft.com/office/word/2006/wordml" xmlns:wps="http://schemas.microsoft.com/office/word/2010/wordprocessingShape" mc:Ignorable="w14 w15 w16se wp14">
+<w:endnotes xmlns:wpc="http://schemas.microsoft.com/office/word/2010/wordprocessingCanvas" xmlns:cx="http://schemas.microsoft.com/office/drawing/2014/chartex" xmlns:cx1="http://schemas.microsoft.com/office/drawing/2015/9/8/chartex" xmlns:cx2="http://schemas.microsoft.com/office/drawing/2015/10/21/chartex" xmlns:cx3="http://schemas.microsoft.com/office/drawing/2016/5/9/chartex" xmlns:cx4="http://schemas.microsoft.com/office/drawing/2016/5/10/chartex" xmlns:cx5="http://schemas.microsoft.com/office/drawing/2016/5/11/chartex" xmlns:cx6="http://schemas.microsoft.com/office/drawing/2016/5/12/chartex" xmlns:cx7="http://schemas.microsoft.com/office/drawing/2016/5/13/chartex" xmlns:cx8="http://schemas.microsoft.com/office/drawing/2016/5/14/chartex" xmlns:mc="http://schemas.openxmlformats.org/markup-compatibility/2006" xmlns:aink="http://schemas.microsoft.com/office/drawing/2016/ink" xmlns:am3d="http://schemas.microsoft.com/office/drawing/2017/model3d" xmlns:o="urn:schemas-microsoft-com:office:office" xmlns:r="http://schemas.openxmlformats.org/officeDocument/2006/relationships" xmlns:m="http://schemas.openxmlformats.org/officeDocument/2006/math" xmlns:v="urn:schemas-microsoft-com:vml" xmlns:wp14="http://schemas.microsoft.com/office/word/2010/wordprocessingDrawing" xmlns:wp="http://schemas.openxmlformats.org/drawingml/2006/wordprocessingDrawing" xmlns:w10="urn:schemas-microsoft-com:office:word" xmlns:w="http://schemas.openxmlformats.org/wordprocessingml/2006/main" xmlns:w14="http://schemas.microsoft.com/office/word/2010/wordml" xmlns:w15="http://schemas.microsoft.com/office/word/2012/wordml" xmlns:w16cex="http://schemas.microsoft.com/office/word/2018/wordml/cex" xmlns:w16cid="http://schemas.microsoft.com/office/word/2016/wordml/cid" xmlns:w16="http://schemas.microsoft.com/office/word/2018/wordml" xmlns:w16sdtdh="http://schemas.microsoft.com/office/word/2020/wordml/sdtdatahash" xmlns:w16se="http://schemas.microsoft.com/office/word/2015/wordml/symex" xmlns:wpg="http://schemas.microsoft.com/office/word/2010/wordprocessingGroup" xmlns:wpi="http://schemas.microsoft.com/office/word/2010/wordprocessingInk" xmlns:wne="http://schemas.microsoft.com/office/word/2006/wordml" xmlns:wps="http://schemas.microsoft.com/office/word/2010/wordprocessingShape" mc:Ignorable="w14 w15 w16se w16cid w16 w16cex w16sdtdh wp14">
   <w:endnote w:type="separator" w:id="-1">
     <w:p>
       <w:pPr>
@@ -1550,7 +2941,7 @@
 </file>
 
 <file path=word/footer1.xml><?xml version="1.0" encoding="utf-8"?>
-<w:ftr xmlns:wpc="http://schemas.microsoft.com/office/word/2010/wordprocessingCanvas" xmlns:cx="http://schemas.microsoft.com/office/drawing/2014/chartex" xmlns:cx1="http://schemas.microsoft.com/office/drawing/2015/9/8/chartex" xmlns:mc="http://schemas.openxmlformats.org/markup-compatibility/2006" xmlns:o="urn:schemas-microsoft-com:office:office" xmlns:r="http://schemas.openxmlformats.org/officeDocument/2006/relationships" xmlns:m="http://schemas.openxmlformats.org/officeDocument/2006/math" xmlns:v="urn:schemas-microsoft-com:vml" xmlns:wp14="http://schemas.microsoft.com/office/word/2010/wordprocessingDrawing" xmlns:wp="http://schemas.openxmlformats.org/drawingml/2006/wordprocessingDrawing" xmlns:w10="urn:schemas-microsoft-com:office:word" xmlns:w="http://schemas.openxmlformats.org/wordprocessingml/2006/main" xmlns:w14="http://schemas.microsoft.com/office/word/2010/wordml" xmlns:w15="http://schemas.microsoft.com/office/word/2012/wordml" xmlns:w16se="http://schemas.microsoft.com/office/word/2015/wordml/symex" xmlns:wpg="http://schemas.microsoft.com/office/word/2010/wordprocessingGroup" xmlns:wpi="http://schemas.microsoft.com/office/word/2010/wordprocessingInk" xmlns:wne="http://schemas.microsoft.com/office/word/2006/wordml" xmlns:wps="http://schemas.microsoft.com/office/word/2010/wordprocessingShape" mc:Ignorable="w14 w15 w16se wp14">
+<w:ftr xmlns:wpc="http://schemas.microsoft.com/office/word/2010/wordprocessingCanvas" xmlns:cx="http://schemas.microsoft.com/office/drawing/2014/chartex" xmlns:cx1="http://schemas.microsoft.com/office/drawing/2015/9/8/chartex" xmlns:cx2="http://schemas.microsoft.com/office/drawing/2015/10/21/chartex" xmlns:cx3="http://schemas.microsoft.com/office/drawing/2016/5/9/chartex" xmlns:cx4="http://schemas.microsoft.com/office/drawing/2016/5/10/chartex" xmlns:cx5="http://schemas.microsoft.com/office/drawing/2016/5/11/chartex" xmlns:cx6="http://schemas.microsoft.com/office/drawing/2016/5/12/chartex" xmlns:cx7="http://schemas.microsoft.com/office/drawing/2016/5/13/chartex" xmlns:cx8="http://schemas.microsoft.com/office/drawing/2016/5/14/chartex" xmlns:mc="http://schemas.openxmlformats.org/markup-compatibility/2006" xmlns:aink="http://schemas.microsoft.com/office/drawing/2016/ink" xmlns:am3d="http://schemas.microsoft.com/office/drawing/2017/model3d" xmlns:o="urn:schemas-microsoft-com:office:office" xmlns:r="http://schemas.openxmlformats.org/officeDocument/2006/relationships" xmlns:m="http://schemas.openxmlformats.org/officeDocument/2006/math" xmlns:v="urn:schemas-microsoft-com:vml" xmlns:wp14="http://schemas.microsoft.com/office/word/2010/wordprocessingDrawing" xmlns:wp="http://schemas.openxmlformats.org/drawingml/2006/wordprocessingDrawing" xmlns:w10="urn:schemas-microsoft-com:office:word" xmlns:w="http://schemas.openxmlformats.org/wordprocessingml/2006/main" xmlns:w14="http://schemas.microsoft.com/office/word/2010/wordml" xmlns:w15="http://schemas.microsoft.com/office/word/2012/wordml" xmlns:w16cex="http://schemas.microsoft.com/office/word/2018/wordml/cex" xmlns:w16cid="http://schemas.microsoft.com/office/word/2016/wordml/cid" xmlns:w16="http://schemas.microsoft.com/office/word/2018/wordml" xmlns:w16sdtdh="http://schemas.microsoft.com/office/word/2020/wordml/sdtdatahash" xmlns:w16se="http://schemas.microsoft.com/office/word/2015/wordml/symex" xmlns:wpg="http://schemas.microsoft.com/office/word/2010/wordprocessingGroup" xmlns:wpi="http://schemas.microsoft.com/office/word/2010/wordprocessingInk" xmlns:wne="http://schemas.microsoft.com/office/word/2006/wordml" xmlns:wps="http://schemas.microsoft.com/office/word/2010/wordprocessingShape" mc:Ignorable="w14 w15 w16se w16cid w16 w16cex w16sdtdh wp14">
   <w:sdt>
     <w:sdtPr>
       <w:rPr>
@@ -1627,7 +3018,7 @@
 </file>
 
 <file path=word/footer2.xml><?xml version="1.0" encoding="utf-8"?>
-<w:ftr xmlns:wpc="http://schemas.microsoft.com/office/word/2010/wordprocessingCanvas" xmlns:cx="http://schemas.microsoft.com/office/drawing/2014/chartex" xmlns:cx1="http://schemas.microsoft.com/office/drawing/2015/9/8/chartex" xmlns:mc="http://schemas.openxmlformats.org/markup-compatibility/2006" xmlns:o="urn:schemas-microsoft-com:office:office" xmlns:r="http://schemas.openxmlformats.org/officeDocument/2006/relationships" xmlns:m="http://schemas.openxmlformats.org/officeDocument/2006/math" xmlns:v="urn:schemas-microsoft-com:vml" xmlns:wp14="http://schemas.microsoft.com/office/word/2010/wordprocessingDrawing" xmlns:wp="http://schemas.openxmlformats.org/drawingml/2006/wordprocessingDrawing" xmlns:w10="urn:schemas-microsoft-com:office:word" xmlns:w="http://schemas.openxmlformats.org/wordprocessingml/2006/main" xmlns:w14="http://schemas.microsoft.com/office/word/2010/wordml" xmlns:w15="http://schemas.microsoft.com/office/word/2012/wordml" xmlns:w16se="http://schemas.microsoft.com/office/word/2015/wordml/symex" xmlns:wpg="http://schemas.microsoft.com/office/word/2010/wordprocessingGroup" xmlns:wpi="http://schemas.microsoft.com/office/word/2010/wordprocessingInk" xmlns:wne="http://schemas.microsoft.com/office/word/2006/wordml" xmlns:wps="http://schemas.microsoft.com/office/word/2010/wordprocessingShape" mc:Ignorable="w14 w15 w16se wp14">
+<w:ftr xmlns:wpc="http://schemas.microsoft.com/office/word/2010/wordprocessingCanvas" xmlns:cx="http://schemas.microsoft.com/office/drawing/2014/chartex" xmlns:cx1="http://schemas.microsoft.com/office/drawing/2015/9/8/chartex" xmlns:cx2="http://schemas.microsoft.com/office/drawing/2015/10/21/chartex" xmlns:cx3="http://schemas.microsoft.com/office/drawing/2016/5/9/chartex" xmlns:cx4="http://schemas.microsoft.com/office/drawing/2016/5/10/chartex" xmlns:cx5="http://schemas.microsoft.com/office/drawing/2016/5/11/chartex" xmlns:cx6="http://schemas.microsoft.com/office/drawing/2016/5/12/chartex" xmlns:cx7="http://schemas.microsoft.com/office/drawing/2016/5/13/chartex" xmlns:cx8="http://schemas.microsoft.com/office/drawing/2016/5/14/chartex" xmlns:mc="http://schemas.openxmlformats.org/markup-compatibility/2006" xmlns:aink="http://schemas.microsoft.com/office/drawing/2016/ink" xmlns:am3d="http://schemas.microsoft.com/office/drawing/2017/model3d" xmlns:o="urn:schemas-microsoft-com:office:office" xmlns:r="http://schemas.openxmlformats.org/officeDocument/2006/relationships" xmlns:m="http://schemas.openxmlformats.org/officeDocument/2006/math" xmlns:v="urn:schemas-microsoft-com:vml" xmlns:wp14="http://schemas.microsoft.com/office/word/2010/wordprocessingDrawing" xmlns:wp="http://schemas.openxmlformats.org/drawingml/2006/wordprocessingDrawing" xmlns:w10="urn:schemas-microsoft-com:office:word" xmlns:w="http://schemas.openxmlformats.org/wordprocessingml/2006/main" xmlns:w14="http://schemas.microsoft.com/office/word/2010/wordml" xmlns:w15="http://schemas.microsoft.com/office/word/2012/wordml" xmlns:w16cex="http://schemas.microsoft.com/office/word/2018/wordml/cex" xmlns:w16cid="http://schemas.microsoft.com/office/word/2016/wordml/cid" xmlns:w16="http://schemas.microsoft.com/office/word/2018/wordml" xmlns:w16sdtdh="http://schemas.microsoft.com/office/word/2020/wordml/sdtdatahash" xmlns:w16se="http://schemas.microsoft.com/office/word/2015/wordml/symex" xmlns:wpg="http://schemas.microsoft.com/office/word/2010/wordprocessingGroup" xmlns:wpi="http://schemas.microsoft.com/office/word/2010/wordprocessingInk" xmlns:wne="http://schemas.microsoft.com/office/word/2006/wordml" xmlns:wps="http://schemas.microsoft.com/office/word/2010/wordprocessingShape" mc:Ignorable="w14 w15 w16se w16cid w16 w16cex w16sdtdh wp14">
   <w:p>
     <w:pPr>
       <w:pStyle w:val="a7"/>
@@ -1642,7 +3033,7 @@
 </file>
 
 <file path=word/footnotes.xml><?xml version="1.0" encoding="utf-8"?>
-<w:footnotes xmlns:wpc="http://schemas.microsoft.com/office/word/2010/wordprocessingCanvas" xmlns:cx="http://schemas.microsoft.com/office/drawing/2014/chartex" xmlns:cx1="http://schemas.microsoft.com/office/drawing/2015/9/8/chartex" xmlns:mc="http://schemas.openxmlformats.org/markup-compatibility/2006" xmlns:o="urn:schemas-microsoft-com:office:office" xmlns:r="http://schemas.openxmlformats.org/officeDocument/2006/relationships" xmlns:m="http://schemas.openxmlformats.org/officeDocument/2006/math" xmlns:v="urn:schemas-microsoft-com:vml" xmlns:wp14="http://schemas.microsoft.com/office/word/2010/wordprocessingDrawing" xmlns:wp="http://schemas.openxmlformats.org/drawingml/2006/wordprocessingDrawing" xmlns:w10="urn:schemas-microsoft-com:office:word" xmlns:w="http://schemas.openxmlformats.org/wordprocessingml/2006/main" xmlns:w14="http://schemas.microsoft.com/office/word/2010/wordml" xmlns:w15="http://schemas.microsoft.com/office/word/2012/wordml" xmlns:w16se="http://schemas.microsoft.com/office/word/2015/wordml/symex" xmlns:wpg="http://schemas.microsoft.com/office/word/2010/wordprocessingGroup" xmlns:wpi="http://schemas.microsoft.com/office/word/2010/wordprocessingInk" xmlns:wne="http://schemas.microsoft.com/office/word/2006/wordml" xmlns:wps="http://schemas.microsoft.com/office/word/2010/wordprocessingShape" mc:Ignorable="w14 w15 w16se wp14">
+<w:footnotes xmlns:wpc="http://schemas.microsoft.com/office/word/2010/wordprocessingCanvas" xmlns:cx="http://schemas.microsoft.com/office/drawing/2014/chartex" xmlns:cx1="http://schemas.microsoft.com/office/drawing/2015/9/8/chartex" xmlns:cx2="http://schemas.microsoft.com/office/drawing/2015/10/21/chartex" xmlns:cx3="http://schemas.microsoft.com/office/drawing/2016/5/9/chartex" xmlns:cx4="http://schemas.microsoft.com/office/drawing/2016/5/10/chartex" xmlns:cx5="http://schemas.microsoft.com/office/drawing/2016/5/11/chartex" xmlns:cx6="http://schemas.microsoft.com/office/drawing/2016/5/12/chartex" xmlns:cx7="http://schemas.microsoft.com/office/drawing/2016/5/13/chartex" xmlns:cx8="http://schemas.microsoft.com/office/drawing/2016/5/14/chartex" xmlns:mc="http://schemas.openxmlformats.org/markup-compatibility/2006" xmlns:aink="http://schemas.microsoft.com/office/drawing/2016/ink" xmlns:am3d="http://schemas.microsoft.com/office/drawing/2017/model3d" xmlns:o="urn:schemas-microsoft-com:office:office" xmlns:r="http://schemas.openxmlformats.org/officeDocument/2006/relationships" xmlns:m="http://schemas.openxmlformats.org/officeDocument/2006/math" xmlns:v="urn:schemas-microsoft-com:vml" xmlns:wp14="http://schemas.microsoft.com/office/word/2010/wordprocessingDrawing" xmlns:wp="http://schemas.openxmlformats.org/drawingml/2006/wordprocessingDrawing" xmlns:w10="urn:schemas-microsoft-com:office:word" xmlns:w="http://schemas.openxmlformats.org/wordprocessingml/2006/main" xmlns:w14="http://schemas.microsoft.com/office/word/2010/wordml" xmlns:w15="http://schemas.microsoft.com/office/word/2012/wordml" xmlns:w16cex="http://schemas.microsoft.com/office/word/2018/wordml/cex" xmlns:w16cid="http://schemas.microsoft.com/office/word/2016/wordml/cid" xmlns:w16="http://schemas.microsoft.com/office/word/2018/wordml" xmlns:w16sdtdh="http://schemas.microsoft.com/office/word/2020/wordml/sdtdatahash" xmlns:w16se="http://schemas.microsoft.com/office/word/2015/wordml/symex" xmlns:wpg="http://schemas.microsoft.com/office/word/2010/wordprocessingGroup" xmlns:wpi="http://schemas.microsoft.com/office/word/2010/wordprocessingInk" xmlns:wne="http://schemas.microsoft.com/office/word/2006/wordml" xmlns:wps="http://schemas.microsoft.com/office/word/2010/wordprocessingShape" mc:Ignorable="w14 w15 w16se w16cid w16 w16cex w16sdtdh wp14">
   <w:footnote w:type="separator" w:id="-1">
     <w:p>
       <w:pPr>
@@ -1667,7 +3058,7 @@
 </file>
 
 <file path=word/numbering.xml><?xml version="1.0" encoding="utf-8"?>
-<w:numbering xmlns:wpc="http://schemas.microsoft.com/office/word/2010/wordprocessingCanvas" xmlns:cx="http://schemas.microsoft.com/office/drawing/2014/chartex" xmlns:cx1="http://schemas.microsoft.com/office/drawing/2015/9/8/chartex" xmlns:mc="http://schemas.openxmlformats.org/markup-compatibility/2006" xmlns:o="urn:schemas-microsoft-com:office:office" xmlns:r="http://schemas.openxmlformats.org/officeDocument/2006/relationships" xmlns:m="http://schemas.openxmlformats.org/officeDocument/2006/math" xmlns:v="urn:schemas-microsoft-com:vml" xmlns:wp14="http://schemas.microsoft.com/office/word/2010/wordprocessingDrawing" xmlns:wp="http://schemas.openxmlformats.org/drawingml/2006/wordprocessingDrawing" xmlns:w10="urn:schemas-microsoft-com:office:word" xmlns:w="http://schemas.openxmlformats.org/wordprocessingml/2006/main" xmlns:w14="http://schemas.microsoft.com/office/word/2010/wordml" xmlns:w15="http://schemas.microsoft.com/office/word/2012/wordml" xmlns:w16se="http://schemas.microsoft.com/office/word/2015/wordml/symex" xmlns:wpg="http://schemas.microsoft.com/office/word/2010/wordprocessingGroup" xmlns:wpi="http://schemas.microsoft.com/office/word/2010/wordprocessingInk" xmlns:wne="http://schemas.microsoft.com/office/word/2006/wordml" xmlns:wps="http://schemas.microsoft.com/office/word/2010/wordprocessingShape" mc:Ignorable="w14 w15 w16se wp14">
+<w:numbering xmlns:wpc="http://schemas.microsoft.com/office/word/2010/wordprocessingCanvas" xmlns:cx="http://schemas.microsoft.com/office/drawing/2014/chartex" xmlns:cx1="http://schemas.microsoft.com/office/drawing/2015/9/8/chartex" xmlns:cx2="http://schemas.microsoft.com/office/drawing/2015/10/21/chartex" xmlns:cx3="http://schemas.microsoft.com/office/drawing/2016/5/9/chartex" xmlns:cx4="http://schemas.microsoft.com/office/drawing/2016/5/10/chartex" xmlns:cx5="http://schemas.microsoft.com/office/drawing/2016/5/11/chartex" xmlns:cx6="http://schemas.microsoft.com/office/drawing/2016/5/12/chartex" xmlns:cx7="http://schemas.microsoft.com/office/drawing/2016/5/13/chartex" xmlns:cx8="http://schemas.microsoft.com/office/drawing/2016/5/14/chartex" xmlns:mc="http://schemas.openxmlformats.org/markup-compatibility/2006" xmlns:aink="http://schemas.microsoft.com/office/drawing/2016/ink" xmlns:am3d="http://schemas.microsoft.com/office/drawing/2017/model3d" xmlns:o="urn:schemas-microsoft-com:office:office" xmlns:r="http://schemas.openxmlformats.org/officeDocument/2006/relationships" xmlns:m="http://schemas.openxmlformats.org/officeDocument/2006/math" xmlns:v="urn:schemas-microsoft-com:vml" xmlns:wp14="http://schemas.microsoft.com/office/word/2010/wordprocessingDrawing" xmlns:wp="http://schemas.openxmlformats.org/drawingml/2006/wordprocessingDrawing" xmlns:w10="urn:schemas-microsoft-com:office:word" xmlns:w="http://schemas.openxmlformats.org/wordprocessingml/2006/main" xmlns:w14="http://schemas.microsoft.com/office/word/2010/wordml" xmlns:w15="http://schemas.microsoft.com/office/word/2012/wordml" xmlns:w16cex="http://schemas.microsoft.com/office/word/2018/wordml/cex" xmlns:w16cid="http://schemas.microsoft.com/office/word/2016/wordml/cid" xmlns:w16="http://schemas.microsoft.com/office/word/2018/wordml" xmlns:w16sdtdh="http://schemas.microsoft.com/office/word/2020/wordml/sdtdatahash" xmlns:w16se="http://schemas.microsoft.com/office/word/2015/wordml/symex" xmlns:wpg="http://schemas.microsoft.com/office/word/2010/wordprocessingGroup" xmlns:wpi="http://schemas.microsoft.com/office/word/2010/wordprocessingInk" xmlns:wne="http://schemas.microsoft.com/office/word/2006/wordml" xmlns:wps="http://schemas.microsoft.com/office/word/2010/wordprocessingShape" mc:Ignorable="w14 w15 w16se w16cid w16 w16cex w16sdtdh wp14">
   <w:abstractNum w:abstractNumId="0" w15:restartNumberingAfterBreak="0">
     <w:nsid w:val="079350C4"/>
     <w:multiLevelType w:val="hybridMultilevel"/>
@@ -2105,6 +3496,95 @@
     </w:lvl>
   </w:abstractNum>
   <w:abstractNum w:abstractNumId="5" w15:restartNumberingAfterBreak="0">
+    <w:nsid w:val="33310B6B"/>
+    <w:multiLevelType w:val="hybridMultilevel"/>
+    <w:tmpl w:val="75BC0C54"/>
+    <w:lvl w:ilvl="0" w:tplc="80A6C8E4">
+      <w:start w:val="1"/>
+      <w:numFmt w:val="decimal"/>
+      <w:lvlText w:val="%1."/>
+      <w:lvlJc w:val="left"/>
+      <w:pPr>
+        <w:ind w:left="1069" w:hanging="360"/>
+      </w:pPr>
+      <w:rPr>
+        <w:rFonts w:hint="default"/>
+      </w:rPr>
+    </w:lvl>
+    <w:lvl w:ilvl="1" w:tplc="04190019" w:tentative="1">
+      <w:start w:val="1"/>
+      <w:numFmt w:val="lowerLetter"/>
+      <w:lvlText w:val="%2."/>
+      <w:lvlJc w:val="left"/>
+      <w:pPr>
+        <w:ind w:left="1789" w:hanging="360"/>
+      </w:pPr>
+    </w:lvl>
+    <w:lvl w:ilvl="2" w:tplc="0419001B" w:tentative="1">
+      <w:start w:val="1"/>
+      <w:numFmt w:val="lowerRoman"/>
+      <w:lvlText w:val="%3."/>
+      <w:lvlJc w:val="right"/>
+      <w:pPr>
+        <w:ind w:left="2509" w:hanging="180"/>
+      </w:pPr>
+    </w:lvl>
+    <w:lvl w:ilvl="3" w:tplc="0419000F" w:tentative="1">
+      <w:start w:val="1"/>
+      <w:numFmt w:val="decimal"/>
+      <w:lvlText w:val="%4."/>
+      <w:lvlJc w:val="left"/>
+      <w:pPr>
+        <w:ind w:left="3229" w:hanging="360"/>
+      </w:pPr>
+    </w:lvl>
+    <w:lvl w:ilvl="4" w:tplc="04190019" w:tentative="1">
+      <w:start w:val="1"/>
+      <w:numFmt w:val="lowerLetter"/>
+      <w:lvlText w:val="%5."/>
+      <w:lvlJc w:val="left"/>
+      <w:pPr>
+        <w:ind w:left="3949" w:hanging="360"/>
+      </w:pPr>
+    </w:lvl>
+    <w:lvl w:ilvl="5" w:tplc="0419001B" w:tentative="1">
+      <w:start w:val="1"/>
+      <w:numFmt w:val="lowerRoman"/>
+      <w:lvlText w:val="%6."/>
+      <w:lvlJc w:val="right"/>
+      <w:pPr>
+        <w:ind w:left="4669" w:hanging="180"/>
+      </w:pPr>
+    </w:lvl>
+    <w:lvl w:ilvl="6" w:tplc="0419000F" w:tentative="1">
+      <w:start w:val="1"/>
+      <w:numFmt w:val="decimal"/>
+      <w:lvlText w:val="%7."/>
+      <w:lvlJc w:val="left"/>
+      <w:pPr>
+        <w:ind w:left="5389" w:hanging="360"/>
+      </w:pPr>
+    </w:lvl>
+    <w:lvl w:ilvl="7" w:tplc="04190019" w:tentative="1">
+      <w:start w:val="1"/>
+      <w:numFmt w:val="lowerLetter"/>
+      <w:lvlText w:val="%8."/>
+      <w:lvlJc w:val="left"/>
+      <w:pPr>
+        <w:ind w:left="6109" w:hanging="360"/>
+      </w:pPr>
+    </w:lvl>
+    <w:lvl w:ilvl="8" w:tplc="0419001B" w:tentative="1">
+      <w:start w:val="1"/>
+      <w:numFmt w:val="lowerRoman"/>
+      <w:lvlText w:val="%9."/>
+      <w:lvlJc w:val="right"/>
+      <w:pPr>
+        <w:ind w:left="6829" w:hanging="180"/>
+      </w:pPr>
+    </w:lvl>
+  </w:abstractNum>
+  <w:abstractNum w:abstractNumId="6" w15:restartNumberingAfterBreak="0">
     <w:nsid w:val="3AC25FE1"/>
     <w:multiLevelType w:val="multilevel"/>
     <w:tmpl w:val="2FBE1454"/>
@@ -2253,7 +3733,7 @@
       </w:rPr>
     </w:lvl>
   </w:abstractNum>
-  <w:abstractNum w:abstractNumId="6" w15:restartNumberingAfterBreak="0">
+  <w:abstractNum w:abstractNumId="7" w15:restartNumberingAfterBreak="0">
     <w:nsid w:val="417D0FAB"/>
     <w:multiLevelType w:val="hybridMultilevel"/>
     <w:tmpl w:val="6AF82510"/>
@@ -2344,7 +3824,7 @@
       </w:pPr>
     </w:lvl>
   </w:abstractNum>
-  <w:abstractNum w:abstractNumId="7" w15:restartNumberingAfterBreak="0">
+  <w:abstractNum w:abstractNumId="8" w15:restartNumberingAfterBreak="0">
     <w:nsid w:val="46E76008"/>
     <w:multiLevelType w:val="hybridMultilevel"/>
     <w:tmpl w:val="E034C16E"/>
@@ -2433,7 +3913,96 @@
       </w:pPr>
     </w:lvl>
   </w:abstractNum>
-  <w:abstractNum w:abstractNumId="8" w15:restartNumberingAfterBreak="0">
+  <w:abstractNum w:abstractNumId="9" w15:restartNumberingAfterBreak="0">
+    <w:nsid w:val="58D65691"/>
+    <w:multiLevelType w:val="hybridMultilevel"/>
+    <w:tmpl w:val="4CCCBAE8"/>
+    <w:lvl w:ilvl="0" w:tplc="D1B6EAFC">
+      <w:start w:val="1"/>
+      <w:numFmt w:val="decimal"/>
+      <w:lvlText w:val="%1."/>
+      <w:lvlJc w:val="left"/>
+      <w:pPr>
+        <w:ind w:left="1069" w:hanging="360"/>
+      </w:pPr>
+      <w:rPr>
+        <w:rFonts w:hint="default"/>
+      </w:rPr>
+    </w:lvl>
+    <w:lvl w:ilvl="1" w:tplc="04190019" w:tentative="1">
+      <w:start w:val="1"/>
+      <w:numFmt w:val="lowerLetter"/>
+      <w:lvlText w:val="%2."/>
+      <w:lvlJc w:val="left"/>
+      <w:pPr>
+        <w:ind w:left="1789" w:hanging="360"/>
+      </w:pPr>
+    </w:lvl>
+    <w:lvl w:ilvl="2" w:tplc="0419001B" w:tentative="1">
+      <w:start w:val="1"/>
+      <w:numFmt w:val="lowerRoman"/>
+      <w:lvlText w:val="%3."/>
+      <w:lvlJc w:val="right"/>
+      <w:pPr>
+        <w:ind w:left="2509" w:hanging="180"/>
+      </w:pPr>
+    </w:lvl>
+    <w:lvl w:ilvl="3" w:tplc="0419000F" w:tentative="1">
+      <w:start w:val="1"/>
+      <w:numFmt w:val="decimal"/>
+      <w:lvlText w:val="%4."/>
+      <w:lvlJc w:val="left"/>
+      <w:pPr>
+        <w:ind w:left="3229" w:hanging="360"/>
+      </w:pPr>
+    </w:lvl>
+    <w:lvl w:ilvl="4" w:tplc="04190019" w:tentative="1">
+      <w:start w:val="1"/>
+      <w:numFmt w:val="lowerLetter"/>
+      <w:lvlText w:val="%5."/>
+      <w:lvlJc w:val="left"/>
+      <w:pPr>
+        <w:ind w:left="3949" w:hanging="360"/>
+      </w:pPr>
+    </w:lvl>
+    <w:lvl w:ilvl="5" w:tplc="0419001B" w:tentative="1">
+      <w:start w:val="1"/>
+      <w:numFmt w:val="lowerRoman"/>
+      <w:lvlText w:val="%6."/>
+      <w:lvlJc w:val="right"/>
+      <w:pPr>
+        <w:ind w:left="4669" w:hanging="180"/>
+      </w:pPr>
+    </w:lvl>
+    <w:lvl w:ilvl="6" w:tplc="0419000F" w:tentative="1">
+      <w:start w:val="1"/>
+      <w:numFmt w:val="decimal"/>
+      <w:lvlText w:val="%7."/>
+      <w:lvlJc w:val="left"/>
+      <w:pPr>
+        <w:ind w:left="5389" w:hanging="360"/>
+      </w:pPr>
+    </w:lvl>
+    <w:lvl w:ilvl="7" w:tplc="04190019" w:tentative="1">
+      <w:start w:val="1"/>
+      <w:numFmt w:val="lowerLetter"/>
+      <w:lvlText w:val="%8."/>
+      <w:lvlJc w:val="left"/>
+      <w:pPr>
+        <w:ind w:left="6109" w:hanging="360"/>
+      </w:pPr>
+    </w:lvl>
+    <w:lvl w:ilvl="8" w:tplc="0419001B" w:tentative="1">
+      <w:start w:val="1"/>
+      <w:numFmt w:val="lowerRoman"/>
+      <w:lvlText w:val="%9."/>
+      <w:lvlJc w:val="right"/>
+      <w:pPr>
+        <w:ind w:left="6829" w:hanging="180"/>
+      </w:pPr>
+    </w:lvl>
+  </w:abstractNum>
+  <w:abstractNum w:abstractNumId="10" w15:restartNumberingAfterBreak="0">
     <w:nsid w:val="644E4A24"/>
     <w:multiLevelType w:val="hybridMultilevel"/>
     <w:tmpl w:val="6C8808C2"/>
@@ -2524,7 +4093,7 @@
       </w:pPr>
     </w:lvl>
   </w:abstractNum>
-  <w:abstractNum w:abstractNumId="9" w15:restartNumberingAfterBreak="0">
+  <w:abstractNum w:abstractNumId="11" w15:restartNumberingAfterBreak="0">
     <w:nsid w:val="66633A91"/>
     <w:multiLevelType w:val="hybridMultilevel"/>
     <w:tmpl w:val="2FDEA27C"/>
@@ -2610,7 +4179,7 @@
       </w:pPr>
     </w:lvl>
   </w:abstractNum>
-  <w:abstractNum w:abstractNumId="10" w15:restartNumberingAfterBreak="0">
+  <w:abstractNum w:abstractNumId="12" w15:restartNumberingAfterBreak="0">
     <w:nsid w:val="734E36F5"/>
     <w:multiLevelType w:val="hybridMultilevel"/>
     <w:tmpl w:val="3D949F74"/>
@@ -2697,22 +4266,22 @@
     </w:lvl>
   </w:abstractNum>
   <w:num w:numId="1">
-    <w:abstractNumId w:val="5"/>
+    <w:abstractNumId w:val="6"/>
   </w:num>
   <w:num w:numId="2">
     <w:abstractNumId w:val="2"/>
   </w:num>
   <w:num w:numId="3">
-    <w:abstractNumId w:val="8"/>
+    <w:abstractNumId w:val="10"/>
   </w:num>
   <w:num w:numId="4">
-    <w:abstractNumId w:val="6"/>
+    <w:abstractNumId w:val="7"/>
   </w:num>
   <w:num w:numId="5">
     <w:abstractNumId w:val="3"/>
   </w:num>
   <w:num w:numId="6">
-    <w:abstractNumId w:val="7"/>
+    <w:abstractNumId w:val="8"/>
   </w:num>
   <w:num w:numId="7">
     <w:abstractNumId w:val="0"/>
@@ -2751,19 +4320,25 @@
     <w:abstractNumId w:val="4"/>
   </w:num>
   <w:num w:numId="10">
-    <w:abstractNumId w:val="10"/>
+    <w:abstractNumId w:val="12"/>
   </w:num>
   <w:num w:numId="11">
-    <w:abstractNumId w:val="9"/>
+    <w:abstractNumId w:val="11"/>
   </w:num>
   <w:num w:numId="12">
     <w:abstractNumId w:val="1"/>
+  </w:num>
+  <w:num w:numId="13">
+    <w:abstractNumId w:val="5"/>
+  </w:num>
+  <w:num w:numId="14">
+    <w:abstractNumId w:val="9"/>
   </w:num>
 </w:numbering>
 </file>
 
 <file path=word/styles.xml><?xml version="1.0" encoding="utf-8"?>
-<w:styles xmlns:mc="http://schemas.openxmlformats.org/markup-compatibility/2006" xmlns:r="http://schemas.openxmlformats.org/officeDocument/2006/relationships" xmlns:w="http://schemas.openxmlformats.org/wordprocessingml/2006/main" xmlns:w14="http://schemas.microsoft.com/office/word/2010/wordml" xmlns:w15="http://schemas.microsoft.com/office/word/2012/wordml" xmlns:w16se="http://schemas.microsoft.com/office/word/2015/wordml/symex" mc:Ignorable="w14 w15 w16se">
+<w:styles xmlns:mc="http://schemas.openxmlformats.org/markup-compatibility/2006" xmlns:r="http://schemas.openxmlformats.org/officeDocument/2006/relationships" xmlns:w="http://schemas.openxmlformats.org/wordprocessingml/2006/main" xmlns:w14="http://schemas.microsoft.com/office/word/2010/wordml" xmlns:w15="http://schemas.microsoft.com/office/word/2012/wordml" xmlns:w16cex="http://schemas.microsoft.com/office/word/2018/wordml/cex" xmlns:w16cid="http://schemas.microsoft.com/office/word/2016/wordml/cid" xmlns:w16="http://schemas.microsoft.com/office/word/2018/wordml" xmlns:w16sdtdh="http://schemas.microsoft.com/office/word/2020/wordml/sdtdatahash" xmlns:w16se="http://schemas.microsoft.com/office/word/2015/wordml/symex" mc:Ignorable="w14 w15 w16se w16cid w16 w16cex w16sdtdh">
   <w:docDefaults>
     <w:rPrDefault>
       <w:rPr>
@@ -2779,7 +4354,7 @@
       </w:pPr>
     </w:pPrDefault>
   </w:docDefaults>
-  <w:latentStyles w:defLockedState="0" w:defUIPriority="99" w:defSemiHidden="0" w:defUnhideWhenUsed="0" w:defQFormat="0" w:count="371">
+  <w:latentStyles w:defLockedState="0" w:defUIPriority="99" w:defSemiHidden="0" w:defUnhideWhenUsed="0" w:defQFormat="0" w:count="376">
     <w:lsdException w:name="Normal" w:uiPriority="0" w:qFormat="1"/>
     <w:lsdException w:name="heading 1" w:uiPriority="9" w:qFormat="1"/>
     <w:lsdException w:name="heading 2" w:semiHidden="1" w:uiPriority="9" w:unhideWhenUsed="1" w:qFormat="1"/>
@@ -2885,7 +4460,6 @@
     <w:lsdException w:name="HTML Sample" w:semiHidden="1" w:unhideWhenUsed="1"/>
     <w:lsdException w:name="HTML Typewriter" w:semiHidden="1" w:unhideWhenUsed="1"/>
     <w:lsdException w:name="HTML Variable" w:semiHidden="1" w:unhideWhenUsed="1"/>
-    <w:lsdException w:name="Normal Table" w:semiHidden="1" w:unhideWhenUsed="1"/>
     <w:lsdException w:name="annotation subject" w:semiHidden="1" w:unhideWhenUsed="1"/>
     <w:lsdException w:name="No List" w:semiHidden="1" w:unhideWhenUsed="1"/>
     <w:lsdException w:name="Outline List 1" w:semiHidden="1" w:unhideWhenUsed="1"/>
@@ -2928,11 +4502,8 @@
     <w:lsdException w:name="Table Contemporary" w:semiHidden="1" w:unhideWhenUsed="1"/>
     <w:lsdException w:name="Table Elegant" w:semiHidden="1" w:unhideWhenUsed="1"/>
     <w:lsdException w:name="Table Professional" w:semiHidden="1" w:unhideWhenUsed="1"/>
-    <w:lsdException w:name="Table Subtle 1" w:semiHidden="1" w:unhideWhenUsed="1"/>
     <w:lsdException w:name="Table Subtle 2" w:semiHidden="1" w:unhideWhenUsed="1"/>
     <w:lsdException w:name="Table Web 1" w:semiHidden="1" w:unhideWhenUsed="1"/>
-    <w:lsdException w:name="Table Web 2" w:semiHidden="1" w:unhideWhenUsed="1"/>
-    <w:lsdException w:name="Table Web 3" w:semiHidden="1" w:unhideWhenUsed="1"/>
     <w:lsdException w:name="Balloon Text" w:semiHidden="1" w:unhideWhenUsed="1"/>
     <w:lsdException w:name="Table Grid" w:uiPriority="39"/>
     <w:lsdException w:name="Table Theme" w:semiHidden="1" w:unhideWhenUsed="1"/>
@@ -3151,6 +4722,11 @@
     <w:lsdException w:name="List Table 5 Dark Accent 6" w:uiPriority="50"/>
     <w:lsdException w:name="List Table 6 Colorful Accent 6" w:uiPriority="51"/>
     <w:lsdException w:name="List Table 7 Colorful Accent 6" w:uiPriority="52"/>
+    <w:lsdException w:name="Mention" w:semiHidden="1" w:unhideWhenUsed="1"/>
+    <w:lsdException w:name="Smart Hyperlink" w:semiHidden="1" w:unhideWhenUsed="1"/>
+    <w:lsdException w:name="Hashtag" w:semiHidden="1" w:unhideWhenUsed="1"/>
+    <w:lsdException w:name="Unresolved Mention" w:semiHidden="1" w:unhideWhenUsed="1"/>
+    <w:lsdException w:name="Smart Link" w:semiHidden="1" w:unhideWhenUsed="1"/>
   </w:latentStyles>
   <w:style w:type="paragraph" w:default="1" w:styleId="a">
     <w:name w:val="Normal"/>
@@ -3570,6 +5146,18 @@
       <w:szCs w:val="28"/>
     </w:rPr>
   </w:style>
+  <w:style w:type="character" w:styleId="af5">
+    <w:name w:val="Unresolved Mention"/>
+    <w:basedOn w:val="a0"/>
+    <w:uiPriority w:val="99"/>
+    <w:semiHidden/>
+    <w:unhideWhenUsed/>
+    <w:rsid w:val="00350A79"/>
+    <w:rPr>
+      <w:color w:val="605E5C"/>
+      <w:shd w:val="clear" w:color="auto" w:fill="E1DFDD"/>
+    </w:rPr>
+  </w:style>
 </w:styles>
 </file>
 

</xml_diff>